<commit_message>
Avances del Proyecto Emily
tabla de que hice ig
</commit_message>
<xml_diff>
--- a/Formularios LOGT/Emily Gongora.docx
+++ b/Formularios LOGT/Emily Gongora.docx
@@ -52,25 +52,7 @@
         <w:rPr>
           <w:lang w:val="es-GT"/>
         </w:rPr>
-        <w:t xml:space="preserve"> Emily </w:t>
-      </w:r>
-      <w:r>
-        <w:rPr>
-          <w:lang w:val="es-GT"/>
-        </w:rPr>
-        <w:t xml:space="preserve">Ariana </w:t>
-      </w:r>
-      <w:r>
-        <w:rPr>
-          <w:lang w:val="es-GT"/>
-        </w:rPr>
-        <w:t>Góngora</w:t>
-      </w:r>
-      <w:r>
-        <w:rPr>
-          <w:lang w:val="es-GT"/>
-        </w:rPr>
-        <w:t xml:space="preserve"> G</w:t>
+        <w:t xml:space="preserve"> Emily Ariana Góngora G</w:t>
       </w:r>
       <w:r>
         <w:rPr>
@@ -126,12 +108,12 @@
       </w:tblPr>
       <w:tblGrid>
         <w:gridCol w:w="864"/>
-        <w:gridCol w:w="865"/>
-        <w:gridCol w:w="750"/>
-        <w:gridCol w:w="1850"/>
-        <w:gridCol w:w="1169"/>
+        <w:gridCol w:w="862"/>
+        <w:gridCol w:w="843"/>
+        <w:gridCol w:w="1836"/>
+        <w:gridCol w:w="1161"/>
         <w:gridCol w:w="713"/>
-        <w:gridCol w:w="3139"/>
+        <w:gridCol w:w="3071"/>
       </w:tblGrid>
       <w:tr>
         <w:trPr>
@@ -349,111 +331,119 @@
           </w:tcPr>
           <w:p>
             <w:r>
-              <w:t>2/16</w:t>
-            </w:r>
-          </w:p>
-        </w:tc>
-        <w:tc>
-          <w:tcPr>
-            <w:tcW w:w="0" w:type="auto"/>
-            <w:tcBorders>
-              <w:top w:val="single" w:sz="4" w:space="0" w:color="000000"/>
-              <w:left w:val="single" w:sz="4" w:space="0" w:color="000000"/>
-              <w:bottom w:val="single" w:sz="4" w:space="0" w:color="000000"/>
-              <w:right w:val="single" w:sz="4" w:space="0" w:color="000000"/>
-            </w:tcBorders>
-            <w:tcMar>
-              <w:top w:w="100" w:type="dxa"/>
-              <w:left w:w="100" w:type="dxa"/>
-              <w:bottom w:w="100" w:type="dxa"/>
-              <w:right w:w="100" w:type="dxa"/>
-            </w:tcMar>
-          </w:tcPr>
-          <w:p>
-            <w:r>
-              <w:t>7:30</w:t>
-            </w:r>
-          </w:p>
-        </w:tc>
-        <w:tc>
-          <w:tcPr>
-            <w:tcW w:w="0" w:type="auto"/>
-            <w:tcBorders>
-              <w:top w:val="single" w:sz="4" w:space="0" w:color="000000"/>
-              <w:left w:val="single" w:sz="4" w:space="0" w:color="000000"/>
-              <w:bottom w:val="single" w:sz="4" w:space="0" w:color="000000"/>
-              <w:right w:val="single" w:sz="4" w:space="0" w:color="000000"/>
-            </w:tcBorders>
-            <w:tcMar>
-              <w:top w:w="100" w:type="dxa"/>
-              <w:left w:w="100" w:type="dxa"/>
-              <w:bottom w:w="100" w:type="dxa"/>
-              <w:right w:w="100" w:type="dxa"/>
-            </w:tcMar>
-          </w:tcPr>
-          <w:p>
-            <w:r>
-              <w:t>8:00</w:t>
-            </w:r>
-          </w:p>
-        </w:tc>
-        <w:tc>
-          <w:tcPr>
-            <w:tcW w:w="0" w:type="auto"/>
-            <w:tcBorders>
-              <w:top w:val="single" w:sz="4" w:space="0" w:color="000000"/>
-              <w:left w:val="single" w:sz="4" w:space="0" w:color="000000"/>
-              <w:bottom w:val="single" w:sz="4" w:space="0" w:color="000000"/>
-              <w:right w:val="single" w:sz="4" w:space="0" w:color="000000"/>
-            </w:tcBorders>
-            <w:tcMar>
-              <w:top w:w="100" w:type="dxa"/>
-              <w:left w:w="100" w:type="dxa"/>
-              <w:bottom w:w="100" w:type="dxa"/>
-              <w:right w:w="100" w:type="dxa"/>
-            </w:tcMar>
-          </w:tcPr>
-          <w:p/>
-        </w:tc>
-        <w:tc>
-          <w:tcPr>
-            <w:tcW w:w="0" w:type="auto"/>
-            <w:tcBorders>
-              <w:top w:val="single" w:sz="4" w:space="0" w:color="000000"/>
-              <w:left w:val="single" w:sz="4" w:space="0" w:color="000000"/>
-              <w:bottom w:val="single" w:sz="4" w:space="0" w:color="000000"/>
-              <w:right w:val="single" w:sz="4" w:space="0" w:color="000000"/>
-            </w:tcBorders>
-            <w:tcMar>
-              <w:top w:w="100" w:type="dxa"/>
-              <w:left w:w="100" w:type="dxa"/>
-              <w:bottom w:w="100" w:type="dxa"/>
-              <w:right w:w="100" w:type="dxa"/>
-            </w:tcMar>
-          </w:tcPr>
-          <w:p>
-            <w:r>
-              <w:t xml:space="preserve">30 min </w:t>
-            </w:r>
-          </w:p>
-        </w:tc>
-        <w:tc>
-          <w:tcPr>
-            <w:tcW w:w="0" w:type="auto"/>
-            <w:tcBorders>
-              <w:top w:val="single" w:sz="4" w:space="0" w:color="000000"/>
-              <w:left w:val="single" w:sz="4" w:space="0" w:color="000000"/>
-              <w:bottom w:val="single" w:sz="4" w:space="0" w:color="000000"/>
-              <w:right w:val="single" w:sz="4" w:space="0" w:color="000000"/>
-            </w:tcBorders>
-            <w:tcMar>
-              <w:top w:w="100" w:type="dxa"/>
-              <w:left w:w="100" w:type="dxa"/>
-              <w:bottom w:w="100" w:type="dxa"/>
-              <w:right w:w="100" w:type="dxa"/>
-            </w:tcMar>
-          </w:tcPr>
-          <w:p/>
+              <w:t>2/25</w:t>
+            </w:r>
+          </w:p>
+        </w:tc>
+        <w:tc>
+          <w:tcPr>
+            <w:tcW w:w="0" w:type="auto"/>
+            <w:tcBorders>
+              <w:top w:val="single" w:sz="4" w:space="0" w:color="000000"/>
+              <w:left w:val="single" w:sz="4" w:space="0" w:color="000000"/>
+              <w:bottom w:val="single" w:sz="4" w:space="0" w:color="000000"/>
+              <w:right w:val="single" w:sz="4" w:space="0" w:color="000000"/>
+            </w:tcBorders>
+            <w:tcMar>
+              <w:top w:w="100" w:type="dxa"/>
+              <w:left w:w="100" w:type="dxa"/>
+              <w:bottom w:w="100" w:type="dxa"/>
+              <w:right w:w="100" w:type="dxa"/>
+            </w:tcMar>
+          </w:tcPr>
+          <w:p>
+            <w:r>
+              <w:t>23:15</w:t>
+            </w:r>
+          </w:p>
+        </w:tc>
+        <w:tc>
+          <w:tcPr>
+            <w:tcW w:w="0" w:type="auto"/>
+            <w:tcBorders>
+              <w:top w:val="single" w:sz="4" w:space="0" w:color="000000"/>
+              <w:left w:val="single" w:sz="4" w:space="0" w:color="000000"/>
+              <w:bottom w:val="single" w:sz="4" w:space="0" w:color="000000"/>
+              <w:right w:val="single" w:sz="4" w:space="0" w:color="000000"/>
+            </w:tcBorders>
+            <w:tcMar>
+              <w:top w:w="100" w:type="dxa"/>
+              <w:left w:w="100" w:type="dxa"/>
+              <w:bottom w:w="100" w:type="dxa"/>
+              <w:right w:w="100" w:type="dxa"/>
+            </w:tcMar>
+          </w:tcPr>
+          <w:p>
+            <w:r>
+              <w:t>00:02</w:t>
+            </w:r>
+          </w:p>
+        </w:tc>
+        <w:tc>
+          <w:tcPr>
+            <w:tcW w:w="0" w:type="auto"/>
+            <w:tcBorders>
+              <w:top w:val="single" w:sz="4" w:space="0" w:color="000000"/>
+              <w:left w:val="single" w:sz="4" w:space="0" w:color="000000"/>
+              <w:bottom w:val="single" w:sz="4" w:space="0" w:color="000000"/>
+              <w:right w:val="single" w:sz="4" w:space="0" w:color="000000"/>
+            </w:tcBorders>
+            <w:tcMar>
+              <w:top w:w="100" w:type="dxa"/>
+              <w:left w:w="100" w:type="dxa"/>
+              <w:bottom w:w="100" w:type="dxa"/>
+              <w:right w:w="100" w:type="dxa"/>
+            </w:tcMar>
+          </w:tcPr>
+          <w:p>
+            <w:r>
+              <w:t>10 min</w:t>
+            </w:r>
+          </w:p>
+        </w:tc>
+        <w:tc>
+          <w:tcPr>
+            <w:tcW w:w="0" w:type="auto"/>
+            <w:tcBorders>
+              <w:top w:val="single" w:sz="4" w:space="0" w:color="000000"/>
+              <w:left w:val="single" w:sz="4" w:space="0" w:color="000000"/>
+              <w:bottom w:val="single" w:sz="4" w:space="0" w:color="000000"/>
+              <w:right w:val="single" w:sz="4" w:space="0" w:color="000000"/>
+            </w:tcBorders>
+            <w:tcMar>
+              <w:top w:w="100" w:type="dxa"/>
+              <w:left w:w="100" w:type="dxa"/>
+              <w:bottom w:w="100" w:type="dxa"/>
+              <w:right w:w="100" w:type="dxa"/>
+            </w:tcMar>
+          </w:tcPr>
+          <w:p>
+            <w:r>
+              <w:t>47 min</w:t>
+            </w:r>
+          </w:p>
+        </w:tc>
+        <w:tc>
+          <w:tcPr>
+            <w:tcW w:w="0" w:type="auto"/>
+            <w:tcBorders>
+              <w:top w:val="single" w:sz="4" w:space="0" w:color="000000"/>
+              <w:left w:val="single" w:sz="4" w:space="0" w:color="000000"/>
+              <w:bottom w:val="single" w:sz="4" w:space="0" w:color="000000"/>
+              <w:right w:val="single" w:sz="4" w:space="0" w:color="000000"/>
+            </w:tcBorders>
+            <w:tcMar>
+              <w:top w:w="100" w:type="dxa"/>
+              <w:left w:w="100" w:type="dxa"/>
+              <w:bottom w:w="100" w:type="dxa"/>
+              <w:right w:w="100" w:type="dxa"/>
+            </w:tcMar>
+          </w:tcPr>
+          <w:p>
+            <w:r>
+              <w:t>2</w:t>
+            </w:r>
+          </w:p>
         </w:tc>
         <w:tc>
           <w:tcPr>
@@ -474,48 +464,30 @@
           <w:p>
             <w:pPr>
               <w:rPr>
+                <w:b/>
+                <w:bCs/>
                 <w:lang w:val="es-GT"/>
               </w:rPr>
             </w:pPr>
+            <w:proofErr w:type="gramStart"/>
             <w:r>
               <w:rPr>
                 <w:lang w:val="es-GT"/>
               </w:rPr>
-              <w:t xml:space="preserve">Parte de Resumen (pasando las cosas q hice en un </w:t>
-            </w:r>
-            <w:proofErr w:type="spellStart"/>
+              <w:t>Conclusiones  y</w:t>
+            </w:r>
+            <w:proofErr w:type="gramEnd"/>
             <w:r>
               <w:rPr>
                 <w:lang w:val="es-GT"/>
               </w:rPr>
-              <w:t>doc</w:t>
-            </w:r>
-            <w:proofErr w:type="spellEnd"/>
+              <w:t xml:space="preserve"> O</w:t>
+            </w:r>
             <w:r>
               <w:rPr>
                 <w:lang w:val="es-GT"/>
               </w:rPr>
-              <w:t xml:space="preserve"> aparte en e</w:t>
-            </w:r>
-            <w:r>
-              <w:rPr>
-                <w:lang w:val="es-GT"/>
-              </w:rPr>
-              <w:t xml:space="preserve">l </w:t>
-            </w:r>
-            <w:proofErr w:type="spellStart"/>
-            <w:r>
-              <w:rPr>
-                <w:lang w:val="es-GT"/>
-              </w:rPr>
-              <w:t>word</w:t>
-            </w:r>
-            <w:proofErr w:type="spellEnd"/>
-            <w:r>
-              <w:rPr>
-                <w:lang w:val="es-GT"/>
-              </w:rPr>
-              <w:t>)</w:t>
+              <w:t>bjetivos del proyecto.</w:t>
             </w:r>
           </w:p>
         </w:tc>
@@ -564,6 +536,197 @@
           </w:tcPr>
           <w:p>
             <w:r>
+              <w:t>7:30</w:t>
+            </w:r>
+          </w:p>
+        </w:tc>
+        <w:tc>
+          <w:tcPr>
+            <w:tcW w:w="0" w:type="auto"/>
+            <w:tcBorders>
+              <w:top w:val="single" w:sz="4" w:space="0" w:color="000000"/>
+              <w:left w:val="single" w:sz="4" w:space="0" w:color="000000"/>
+              <w:bottom w:val="single" w:sz="4" w:space="0" w:color="000000"/>
+              <w:right w:val="single" w:sz="4" w:space="0" w:color="000000"/>
+            </w:tcBorders>
+            <w:tcMar>
+              <w:top w:w="100" w:type="dxa"/>
+              <w:left w:w="100" w:type="dxa"/>
+              <w:bottom w:w="100" w:type="dxa"/>
+              <w:right w:w="100" w:type="dxa"/>
+            </w:tcMar>
+          </w:tcPr>
+          <w:p>
+            <w:r>
+              <w:t>8:00</w:t>
+            </w:r>
+          </w:p>
+        </w:tc>
+        <w:tc>
+          <w:tcPr>
+            <w:tcW w:w="0" w:type="auto"/>
+            <w:tcBorders>
+              <w:top w:val="single" w:sz="4" w:space="0" w:color="000000"/>
+              <w:left w:val="single" w:sz="4" w:space="0" w:color="000000"/>
+              <w:bottom w:val="single" w:sz="4" w:space="0" w:color="000000"/>
+              <w:right w:val="single" w:sz="4" w:space="0" w:color="000000"/>
+            </w:tcBorders>
+            <w:tcMar>
+              <w:top w:w="100" w:type="dxa"/>
+              <w:left w:w="100" w:type="dxa"/>
+              <w:bottom w:w="100" w:type="dxa"/>
+              <w:right w:w="100" w:type="dxa"/>
+            </w:tcMar>
+          </w:tcPr>
+          <w:p/>
+        </w:tc>
+        <w:tc>
+          <w:tcPr>
+            <w:tcW w:w="0" w:type="auto"/>
+            <w:tcBorders>
+              <w:top w:val="single" w:sz="4" w:space="0" w:color="000000"/>
+              <w:left w:val="single" w:sz="4" w:space="0" w:color="000000"/>
+              <w:bottom w:val="single" w:sz="4" w:space="0" w:color="000000"/>
+              <w:right w:val="single" w:sz="4" w:space="0" w:color="000000"/>
+            </w:tcBorders>
+            <w:tcMar>
+              <w:top w:w="100" w:type="dxa"/>
+              <w:left w:w="100" w:type="dxa"/>
+              <w:bottom w:w="100" w:type="dxa"/>
+              <w:right w:w="100" w:type="dxa"/>
+            </w:tcMar>
+          </w:tcPr>
+          <w:p>
+            <w:r>
+              <w:t xml:space="preserve">30 min </w:t>
+            </w:r>
+          </w:p>
+        </w:tc>
+        <w:tc>
+          <w:tcPr>
+            <w:tcW w:w="0" w:type="auto"/>
+            <w:tcBorders>
+              <w:top w:val="single" w:sz="4" w:space="0" w:color="000000"/>
+              <w:left w:val="single" w:sz="4" w:space="0" w:color="000000"/>
+              <w:bottom w:val="single" w:sz="4" w:space="0" w:color="000000"/>
+              <w:right w:val="single" w:sz="4" w:space="0" w:color="000000"/>
+            </w:tcBorders>
+            <w:tcMar>
+              <w:top w:w="100" w:type="dxa"/>
+              <w:left w:w="100" w:type="dxa"/>
+              <w:bottom w:w="100" w:type="dxa"/>
+              <w:right w:w="100" w:type="dxa"/>
+            </w:tcMar>
+          </w:tcPr>
+          <w:p>
+            <w:r>
+              <w:t>2</w:t>
+            </w:r>
+          </w:p>
+        </w:tc>
+        <w:tc>
+          <w:tcPr>
+            <w:tcW w:w="0" w:type="auto"/>
+            <w:tcBorders>
+              <w:top w:val="single" w:sz="4" w:space="0" w:color="000000"/>
+              <w:left w:val="single" w:sz="4" w:space="0" w:color="000000"/>
+              <w:bottom w:val="single" w:sz="4" w:space="0" w:color="000000"/>
+              <w:right w:val="single" w:sz="4" w:space="0" w:color="000000"/>
+            </w:tcBorders>
+            <w:tcMar>
+              <w:top w:w="100" w:type="dxa"/>
+              <w:left w:w="100" w:type="dxa"/>
+              <w:bottom w:w="100" w:type="dxa"/>
+              <w:right w:w="100" w:type="dxa"/>
+            </w:tcMar>
+          </w:tcPr>
+          <w:p>
+            <w:pPr>
+              <w:rPr>
+                <w:lang w:val="es-GT"/>
+              </w:rPr>
+            </w:pPr>
+            <w:r>
+              <w:rPr>
+                <w:lang w:val="es-GT"/>
+              </w:rPr>
+              <w:t xml:space="preserve">Parte de Resumen (pasando las cosas q hice en un </w:t>
+            </w:r>
+            <w:proofErr w:type="spellStart"/>
+            <w:r>
+              <w:rPr>
+                <w:lang w:val="es-GT"/>
+              </w:rPr>
+              <w:t>doc</w:t>
+            </w:r>
+            <w:proofErr w:type="spellEnd"/>
+            <w:r>
+              <w:rPr>
+                <w:lang w:val="es-GT"/>
+              </w:rPr>
+              <w:t xml:space="preserve"> aparte en el </w:t>
+            </w:r>
+            <w:proofErr w:type="spellStart"/>
+            <w:r>
+              <w:rPr>
+                <w:lang w:val="es-GT"/>
+              </w:rPr>
+              <w:t>word</w:t>
+            </w:r>
+            <w:proofErr w:type="spellEnd"/>
+            <w:r>
+              <w:rPr>
+                <w:lang w:val="es-GT"/>
+              </w:rPr>
+              <w:t>)</w:t>
+            </w:r>
+          </w:p>
+        </w:tc>
+      </w:tr>
+      <w:tr>
+        <w:trPr>
+          <w:trHeight w:val="500"/>
+        </w:trPr>
+        <w:tc>
+          <w:tcPr>
+            <w:tcW w:w="0" w:type="auto"/>
+            <w:tcBorders>
+              <w:top w:val="single" w:sz="4" w:space="0" w:color="000000"/>
+              <w:left w:val="single" w:sz="4" w:space="0" w:color="000000"/>
+              <w:bottom w:val="single" w:sz="4" w:space="0" w:color="000000"/>
+              <w:right w:val="single" w:sz="4" w:space="0" w:color="000000"/>
+            </w:tcBorders>
+            <w:tcMar>
+              <w:top w:w="100" w:type="dxa"/>
+              <w:left w:w="100" w:type="dxa"/>
+              <w:bottom w:w="100" w:type="dxa"/>
+              <w:right w:w="100" w:type="dxa"/>
+            </w:tcMar>
+          </w:tcPr>
+          <w:p>
+            <w:r>
+              <w:t>2/16</w:t>
+            </w:r>
+          </w:p>
+        </w:tc>
+        <w:tc>
+          <w:tcPr>
+            <w:tcW w:w="0" w:type="auto"/>
+            <w:tcBorders>
+              <w:top w:val="single" w:sz="4" w:space="0" w:color="000000"/>
+              <w:left w:val="single" w:sz="4" w:space="0" w:color="000000"/>
+              <w:bottom w:val="single" w:sz="4" w:space="0" w:color="000000"/>
+              <w:right w:val="single" w:sz="4" w:space="0" w:color="000000"/>
+            </w:tcBorders>
+            <w:tcMar>
+              <w:top w:w="100" w:type="dxa"/>
+              <w:left w:w="100" w:type="dxa"/>
+              <w:bottom w:w="100" w:type="dxa"/>
+              <w:right w:w="100" w:type="dxa"/>
+            </w:tcMar>
+          </w:tcPr>
+          <w:p>
+            <w:r>
               <w:t>7:00</w:t>
             </w:r>
           </w:p>
@@ -646,40 +809,75 @@
               <w:right w:w="100" w:type="dxa"/>
             </w:tcMar>
           </w:tcPr>
-          <w:p/>
-        </w:tc>
-        <w:tc>
-          <w:tcPr>
-            <w:tcW w:w="0" w:type="auto"/>
-            <w:tcBorders>
-              <w:top w:val="single" w:sz="4" w:space="0" w:color="000000"/>
-              <w:left w:val="single" w:sz="4" w:space="0" w:color="000000"/>
-              <w:bottom w:val="single" w:sz="4" w:space="0" w:color="000000"/>
-              <w:right w:val="single" w:sz="4" w:space="0" w:color="000000"/>
-            </w:tcBorders>
-            <w:tcMar>
-              <w:top w:w="100" w:type="dxa"/>
-              <w:left w:w="100" w:type="dxa"/>
-              <w:bottom w:w="100" w:type="dxa"/>
-              <w:right w:w="100" w:type="dxa"/>
-            </w:tcMar>
-          </w:tcPr>
-          <w:p>
+          <w:p>
+            <w:r>
+              <w:t>2</w:t>
+            </w:r>
+          </w:p>
+        </w:tc>
+        <w:tc>
+          <w:tcPr>
+            <w:tcW w:w="0" w:type="auto"/>
+            <w:tcBorders>
+              <w:top w:val="single" w:sz="4" w:space="0" w:color="000000"/>
+              <w:left w:val="single" w:sz="4" w:space="0" w:color="000000"/>
+              <w:bottom w:val="single" w:sz="4" w:space="0" w:color="000000"/>
+              <w:right w:val="single" w:sz="4" w:space="0" w:color="000000"/>
+            </w:tcBorders>
+            <w:tcMar>
+              <w:top w:w="100" w:type="dxa"/>
+              <w:left w:w="100" w:type="dxa"/>
+              <w:bottom w:w="100" w:type="dxa"/>
+              <w:right w:w="100" w:type="dxa"/>
+            </w:tcMar>
+          </w:tcPr>
+          <w:p>
+            <w:pPr>
+              <w:rPr>
+                <w:lang w:val="es-GT"/>
+              </w:rPr>
+            </w:pPr>
             <w:proofErr w:type="spellStart"/>
             <w:r>
+              <w:rPr>
+                <w:lang w:val="es-GT"/>
+              </w:rPr>
               <w:t>Introduccion</w:t>
             </w:r>
             <w:proofErr w:type="spellEnd"/>
             <w:r>
-              <w:t xml:space="preserve"> (</w:t>
+              <w:rPr>
+                <w:lang w:val="es-GT"/>
+              </w:rPr>
+              <w:t xml:space="preserve"> (desde mi </w:t>
             </w:r>
             <w:proofErr w:type="spellStart"/>
             <w:r>
-              <w:t>desde</w:t>
+              <w:rPr>
+                <w:lang w:val="es-GT"/>
+              </w:rPr>
+              <w:t>doc</w:t>
             </w:r>
             <w:proofErr w:type="spellEnd"/>
             <w:r>
-              <w:t xml:space="preserve"> mi doc personal al word del proyecto)</w:t>
+              <w:rPr>
+                <w:lang w:val="es-GT"/>
+              </w:rPr>
+              <w:t xml:space="preserve"> personal al </w:t>
+            </w:r>
+            <w:proofErr w:type="spellStart"/>
+            <w:r>
+              <w:rPr>
+                <w:lang w:val="es-GT"/>
+              </w:rPr>
+              <w:t>word</w:t>
+            </w:r>
+            <w:proofErr w:type="spellEnd"/>
+            <w:r>
+              <w:rPr>
+                <w:lang w:val="es-GT"/>
+              </w:rPr>
+              <w:t xml:space="preserve"> del proyecto)</w:t>
             </w:r>
           </w:p>
         </w:tc>
@@ -816,7 +1014,11 @@
             </w:tcMar>
             <w:hideMark/>
           </w:tcPr>
-          <w:p/>
+          <w:p>
+            <w:r>
+              <w:t>1</w:t>
+            </w:r>
+          </w:p>
         </w:tc>
         <w:tc>
           <w:tcPr>
@@ -986,7 +1188,11 @@
             </w:tcMar>
             <w:hideMark/>
           </w:tcPr>
-          <w:p/>
+          <w:p>
+            <w:r>
+              <w:t>1</w:t>
+            </w:r>
+          </w:p>
         </w:tc>
         <w:tc>
           <w:tcPr>
@@ -1641,6 +1847,7 @@
   <w:style w:type="character" w:default="1" w:styleId="Fuentedeprrafopredeter">
     <w:name w:val="Default Paragraph Font"/>
     <w:uiPriority w:val="1"/>
+    <w:semiHidden/>
     <w:unhideWhenUsed/>
   </w:style>
   <w:style w:type="table" w:default="1" w:styleId="Tablanormal">

</xml_diff>